<commit_message>
Fix invalid element order inside content controls (Webex template)
Word flagged the generated document as unreadable/needing repair,
which silently dropped formatting (hence the wrong font) and likely
broke PDF conversion. Root cause: the <w:sdtPr> elements I built for
every field put <w:id>/<w:tag> before <w:rPr>, but the OOXML schema
requires rPr first (confirmed against the real i589 template's own
content controls, which are correctly ordered). Rebuilt all 26
content controls with the schema-correct sequence (rPr, tag, id,
text) and verified every <w:sdtPr> and <w:rPr> in the document now
follows the canonical element order, in both the plain-text and
signature-image paths.
</commit_message>
<xml_diff>
--- a/plantillas/webex-motion/MOTION_FOR_WEBEX.docx
+++ b/plantillas/webex-motion/MOTION_FOR_WEBEX.docx
@@ -4,8 +4,8 @@
   <w:body>
     <w:sdt>
       <w:sdtPr>
+        <w:tag w:val="abogado"/>
         <w:id w:val="900000001"/>
-        <w:tag w:val="abogado"/>
         <w:text/>
       </w:sdtPr>
       <w:sdtContent>
@@ -149,8 +149,8 @@
     </w:p>
     <w:sdt>
       <w:sdtPr>
+        <w:tag w:val="cliente_nombre"/>
         <w:id w:val="900000002"/>
-        <w:tag w:val="cliente_nombre"/>
         <w:text/>
       </w:sdtPr>
       <w:sdtContent>
@@ -243,8 +243,8 @@
     </w:p>
     <w:sdt>
       <w:sdtPr>
+        <w:tag w:val="corte_sede"/>
         <w:id w:val="900000003"/>
-        <w:tag w:val="corte_sede"/>
         <w:text/>
       </w:sdtPr>
       <w:sdtContent>
@@ -424,13 +424,13 @@
       </w:pPr>
       <w:sdt>
         <w:sdtPr>
-          <w:id w:val="900000006"/>
-          <w:tag w:val="cliente_nombre"/>
           <w:rPr>
             <w:rFonts w:ascii="Times New Roman" w:eastAsia="Times New Roman" w:hAnsi="Times New Roman" w:cs="Times New Roman"/>
             <w:sz w:val="24"/>
             <w:szCs w:val="24"/>
           </w:rPr>
+          <w:tag w:val="cliente_nombre"/>
+          <w:id w:val="900000006"/>
           <w:text/>
         </w:sdtPr>
         <w:sdtContent>
@@ -482,13 +482,13 @@
       </w:r>
       <w:sdt>
         <w:sdtPr>
-          <w:id w:val="900000007"/>
-          <w:tag w:val="a_number"/>
           <w:rPr>
             <w:rFonts w:ascii="Times New Roman" w:eastAsia="Times New Roman" w:hAnsi="Times New Roman" w:cs="Times New Roman"/>
             <w:sz w:val="24"/>
             <w:szCs w:val="24"/>
           </w:rPr>
+          <w:tag w:val="a_number"/>
+          <w:id w:val="900000007"/>
           <w:text/>
         </w:sdtPr>
         <w:sdtContent>
@@ -785,13 +785,13 @@
       </w:r>
       <w:sdt>
         <w:sdtPr>
-          <w:id w:val="900000008"/>
-          <w:tag w:val="juez"/>
           <w:rPr>
             <w:rFonts w:ascii="Times New Roman" w:eastAsia="Times New Roman" w:hAnsi="Times New Roman" w:cs="Times New Roman"/>
             <w:sz w:val="24"/>
             <w:szCs w:val="24"/>
           </w:rPr>
+          <w:tag w:val="juez"/>
+          <w:id w:val="900000008"/>
           <w:text/>
         </w:sdtPr>
         <w:sdtContent>
@@ -825,14 +825,14 @@
       <w:bookmarkEnd w:id="0"/>
       <w:sdt>
         <w:sdtPr>
-          <w:id w:val="900000009"/>
-          <w:tag w:val="proxima_audiencia"/>
           <w:rPr>
             <w:rFonts w:ascii="Times New Roman" w:eastAsia="Times New Roman" w:hAnsi="Times New Roman" w:cs="Times New Roman"/>
             <w:b/>
             <w:sz w:val="24"/>
             <w:szCs w:val="24"/>
           </w:rPr>
+          <w:tag w:val="proxima_audiencia"/>
+          <w:id w:val="900000009"/>
           <w:text/>
         </w:sdtPr>
         <w:sdtContent>
@@ -1570,8 +1570,8 @@
     </w:p>
     <w:sdt>
       <w:sdtPr>
+        <w:tag w:val="abogado"/>
         <w:id w:val="900000010"/>
-        <w:tag w:val="abogado"/>
         <w:text/>
       </w:sdtPr>
       <w:sdtContent>
@@ -1715,8 +1715,8 @@
     </w:p>
     <w:sdt>
       <w:sdtPr>
+        <w:tag w:val="cliente_nombre"/>
         <w:id w:val="900000011"/>
-        <w:tag w:val="cliente_nombre"/>
         <w:text/>
       </w:sdtPr>
       <w:sdtContent>
@@ -1809,8 +1809,8 @@
     </w:p>
     <w:sdt>
       <w:sdtPr>
+        <w:tag w:val="corte_sede"/>
         <w:id w:val="900000004"/>
-        <w:tag w:val="corte_sede"/>
         <w:text/>
       </w:sdtPr>
       <w:sdtContent>
@@ -1885,8 +1885,8 @@
           </w:p>
           <w:sdt>
             <w:sdtPr>
+              <w:tag w:val="cliente_nombre"/>
               <w:id w:val="900000012"/>
-              <w:tag w:val="cliente_nombre"/>
               <w:text/>
             </w:sdtPr>
             <w:sdtContent>
@@ -2023,13 +2023,13 @@
             </w:r>
             <w:sdt>
               <w:sdtPr>
-                <w:id w:val="900000013"/>
-                <w:tag w:val="a_number"/>
                 <w:rPr>
                   <w:rFonts w:ascii="Times New Roman" w:eastAsia="Times New Roman" w:hAnsi="Times New Roman" w:cs="Times New Roman"/>
                   <w:sz w:val="24"/>
                   <w:szCs w:val="24"/>
                 </w:rPr>
+                <w:tag w:val="a_number"/>
+                <w:id w:val="900000013"/>
                 <w:text/>
               </w:sdtPr>
               <w:sdtContent>
@@ -2259,13 +2259,13 @@
       </w:r>
       <w:sdt>
         <w:sdtPr>
-          <w:id w:val="900000014"/>
-          <w:tag w:val="juez"/>
           <w:rPr>
             <w:rFonts w:ascii="Times New Roman" w:eastAsia="Times New Roman" w:hAnsi="Times New Roman" w:cs="Times New Roman"/>
             <w:sz w:val="24"/>
             <w:szCs w:val="24"/>
           </w:rPr>
+          <w:tag w:val="juez"/>
+          <w:id w:val="900000014"/>
           <w:text/>
         </w:sdtPr>
         <w:sdtContent>
@@ -2306,13 +2306,13 @@
       </w:r>
       <w:sdt>
         <w:sdtPr>
-          <w:id w:val="900000015"/>
-          <w:tag w:val="cliente_nombre"/>
           <w:rPr>
             <w:rFonts w:ascii="Times New Roman" w:eastAsia="Times New Roman" w:hAnsi="Times New Roman" w:cs="Times New Roman"/>
             <w:sz w:val="24"/>
             <w:szCs w:val="24"/>
           </w:rPr>
+          <w:tag w:val="cliente_nombre"/>
+          <w:id w:val="900000015"/>
           <w:text/>
         </w:sdtPr>
         <w:sdtContent>
@@ -2719,14 +2719,14 @@
       </w:r>
       <w:sdt>
         <w:sdtPr>
-          <w:id w:val="900000025"/>
-          <w:tag w:val="abogado_firma_imagen"/>
           <w:rPr>
             <w:rFonts w:ascii="Times New Roman" w:eastAsia="Times New Roman" w:hAnsi="Times New Roman" w:cs="Times New Roman"/>
             <w:color w:val="000000"/>
             <w:sz w:val="24"/>
             <w:szCs w:val="24"/>
           </w:rPr>
+          <w:tag w:val="abogado_firma_imagen"/>
+          <w:id w:val="900000025"/>
           <w:text/>
         </w:sdtPr>
         <w:sdtContent>
@@ -2768,13 +2768,13 @@
       </w:r>
       <w:sdt>
         <w:sdtPr>
-          <w:id w:val="900000016"/>
-          <w:tag w:val="abogado_firma"/>
           <w:rPr>
             <w:rFonts w:ascii="Times New Roman" w:eastAsia="Times New Roman" w:hAnsi="Times New Roman" w:cs="Times New Roman"/>
             <w:sz w:val="24"/>
             <w:szCs w:val="24"/>
           </w:rPr>
+          <w:tag w:val="abogado_firma"/>
+          <w:id w:val="900000016"/>
           <w:text/>
         </w:sdtPr>
         <w:sdtContent>
@@ -2855,13 +2855,13 @@
       </w:r>
       <w:sdt>
         <w:sdtPr>
-          <w:id w:val="900000017"/>
-          <w:tag w:val="cliente_nombre"/>
           <w:rPr>
             <w:rFonts w:ascii="Times New Roman" w:eastAsia="Times New Roman" w:hAnsi="Times New Roman" w:cs="Times New Roman"/>
             <w:sz w:val="24"/>
             <w:szCs w:val="24"/>
           </w:rPr>
+          <w:tag w:val="cliente_nombre"/>
+          <w:id w:val="900000017"/>
           <w:text/>
         </w:sdtPr>
         <w:sdtContent>
@@ -3078,8 +3078,8 @@
     </w:p>
     <w:sdt>
       <w:sdtPr>
+        <w:tag w:val="corte_sede"/>
         <w:id w:val="900000005"/>
-        <w:tag w:val="corte_sede"/>
         <w:text/>
       </w:sdtPr>
       <w:sdtContent>
@@ -3136,14 +3136,14 @@
       </w:r>
       <w:sdt>
         <w:sdtPr>
-          <w:id w:val="900000018"/>
-          <w:tag w:val="cliente_nombre"/>
           <w:rPr>
             <w:rFonts w:ascii="Times New Roman" w:hAnsi="Times New Roman" w:cs="Times New Roman"/>
             <w:b/>
             <w:sz w:val="24"/>
             <w:szCs w:val="24"/>
           </w:rPr>
+          <w:tag w:val="cliente_nombre"/>
+          <w:id w:val="900000018"/>
           <w:text/>
         </w:sdtPr>
         <w:sdtContent>
@@ -3190,8 +3190,6 @@
       </w:r>
       <w:sdt>
         <w:sdtPr>
-          <w:id w:val="900000019"/>
-          <w:tag w:val="a_number"/>
           <w:rPr>
             <w:rFonts w:ascii="Times New Roman" w:hAnsi="Times New Roman" w:cs="Times New Roman"/>
             <w:b/>
@@ -3200,6 +3198,8 @@
             <w:sz w:val="24"/>
             <w:szCs w:val="24"/>
           </w:rPr>
+          <w:tag w:val="a_number"/>
+          <w:id w:val="900000019"/>
           <w:text/>
         </w:sdtPr>
         <w:sdtContent>
@@ -3695,13 +3695,13 @@
       </w:r>
       <w:sdt>
         <w:sdtPr>
-          <w:id w:val="900000020"/>
-          <w:tag w:val="juez"/>
           <w:rPr>
             <w:rFonts w:ascii="Times New Roman" w:eastAsia="Times New Roman" w:hAnsi="Times New Roman" w:cs="Times New Roman"/>
             <w:sz w:val="24"/>
             <w:szCs w:val="24"/>
           </w:rPr>
+          <w:tag w:val="juez"/>
+          <w:id w:val="900000020"/>
           <w:text/>
         </w:sdtPr>
         <w:sdtContent>
@@ -3864,8 +3864,8 @@
     </w:p>
     <w:sdt>
       <w:sdtPr>
+        <w:tag w:val="cliente_nombre"/>
         <w:id w:val="900000021"/>
-        <w:tag w:val="cliente_nombre"/>
         <w:text/>
       </w:sdtPr>
       <w:sdtContent>
@@ -3900,13 +3900,13 @@
       </w:r>
       <w:sdt>
         <w:sdtPr>
-          <w:id w:val="900000022"/>
-          <w:tag w:val="a_number"/>
           <w:rPr>
             <w:rFonts w:ascii="Times New Roman" w:eastAsia="Times New Roman" w:hAnsi="Times New Roman" w:cs="Times New Roman"/>
             <w:sz w:val="24"/>
             <w:szCs w:val="24"/>
           </w:rPr>
+          <w:tag w:val="a_number"/>
+          <w:id w:val="900000022"/>
           <w:text/>
         </w:sdtPr>
         <w:sdtContent>
@@ -4005,8 +4005,6 @@
       </w:r>
       <w:sdt>
         <w:sdtPr>
-          <w:id w:val="900000023"/>
-          <w:tag w:val="preparador"/>
           <w:rPr>
             <w:rFonts w:ascii="Times New Roman" w:hAnsi="Times New Roman" w:cs="Times New Roman"/>
             <w:spacing w:val="-3"/>
@@ -4014,6 +4012,8 @@
             <w:szCs w:val="24"/>
             <w:u w:val="single"/>
           </w:rPr>
+          <w:tag w:val="preparador"/>
+          <w:id w:val="900000023"/>
           <w:text/>
         </w:sdtPr>
         <w:sdtContent>
@@ -4226,14 +4226,14 @@
       </w:pPr>
       <w:sdt>
         <w:sdtPr>
-          <w:id w:val="900000026"/>
-          <w:tag w:val="preparador_firma_imagen"/>
           <w:rPr>
             <w:rFonts w:ascii="Times New Roman" w:hAnsi="Times New Roman" w:cs="Times New Roman"/>
             <w:spacing w:val="-3"/>
             <w:sz w:val="24"/>
             <w:szCs w:val="24"/>
           </w:rPr>
+          <w:tag w:val="preparador_firma_imagen"/>
+          <w:id w:val="900000026"/>
           <w:text/>
         </w:sdtPr>
         <w:sdtContent>
@@ -4251,8 +4251,8 @@
     </w:p>
     <w:sdt>
       <w:sdtPr>
+        <w:tag w:val="preparador"/>
         <w:id w:val="900000024"/>
-        <w:tag w:val="preparador"/>
         <w:text/>
       </w:sdtPr>
       <w:sdtContent>

</xml_diff>

<commit_message>
Merge client name and A# into one caption line (Webex motion)
In the original filled document, the case caption's client-name row
and the A# row were two separate paragraphs, each with its own
closing parenthesis — Word always breaks separate paragraphs onto
separate lines, so the A# rendered one row below the name instead of
alongside it. Merged them into a single paragraph (dropping the
redundant second parenthesis) so the client name, ")", and "A#
{number}" all sit on the same line, matching how the rest of the
caption's parenthesis column reads.
</commit_message>
<xml_diff>
--- a/plantillas/webex-motion/MOTION_FOR_WEBEX.docx
+++ b/plantillas/webex-motion/MOTION_FOR_WEBEX.docx
@@ -458,35 +458,7 @@
           <w:sz w:val="24"/>
           <w:szCs w:val="24"/>
         </w:rPr>
-        <w:t xml:space="preserve">                           )</w:t>
-      </w:r>
-    </w:p>
-    <w:p>
-      <w:pPr>
-        <w:tabs>
-          <w:tab w:val="left" w:pos="1920"/>
-        </w:tabs>
-        <w:spacing w:line="276" w:lineRule="auto"/>
-        <w:jc w:val="both"/>
-        <w:rPr>
-          <w:rFonts w:ascii="Times New Roman" w:eastAsia="Times New Roman" w:hAnsi="Times New Roman" w:cs="Times New Roman"/>
-          <w:sz w:val="24"/>
-          <w:szCs w:val="24"/>
-          <w:lang w:val="es-MX"/>
-        </w:rPr>
-      </w:pPr>
-      <w:tab/>
-      <w:tab/>
-      <w:tab/>
-      <w:tab/>
-      <w:tab/>
-      <w:r>
-        <w:rPr>
-          <w:rFonts w:ascii="Times New Roman" w:eastAsia="Times New Roman" w:hAnsi="Times New Roman" w:cs="Times New Roman"/>
-          <w:sz w:val="24"/>
-          <w:szCs w:val="24"/>
-        </w:rPr>
-        <w:t xml:space="preserve">)          A# </w:t>
+        <w:t xml:space="preserve">                           )          A# </w:t>
       </w:r>
       <w:sdt>
         <w:sdtPr>

</xml_diff>

<commit_message>
Right-align the A# near the page's right margin (Webex motion)
Replaced the fixed handful of spaces between ")" and "A#" with a
right-aligned tab stop near the right margin (pos 9300 twips, on an
8.5x11 page with 1in margins), so "A# {number}" always ends flush
against the right edge regardless of how many digits/riders it has,
instead of sitting wherever a fixed space count happened to land it.
</commit_message>
<xml_diff>
--- a/plantillas/webex-motion/MOTION_FOR_WEBEX.docx
+++ b/plantillas/webex-motion/MOTION_FOR_WEBEX.docx
@@ -423,6 +423,9 @@
     </w:p>
     <w:p>
       <w:pPr>
+        <w:tabs>
+          <w:tab w:val="right" w:pos="9300"/>
+        </w:tabs>
         <w:spacing w:line="276" w:lineRule="auto"/>
         <w:jc w:val="both"/>
         <w:rPr>
@@ -458,7 +461,16 @@
           <w:sz w:val="24"/>
           <w:szCs w:val="24"/>
         </w:rPr>
-        <w:t xml:space="preserve">                           )          A# </w:t>
+        <w:t xml:space="preserve">                           )</w:t>
+      </w:r>
+      <w:r>
+        <w:rPr>
+          <w:rFonts w:ascii="Times New Roman" w:eastAsia="Times New Roman" w:hAnsi="Times New Roman" w:cs="Times New Roman"/>
+          <w:sz w:val="24"/>
+          <w:szCs w:val="24"/>
+        </w:rPr>
+        <w:tab/>
+        <w:t xml:space="preserve">A# </w:t>
       </w:r>
       <w:sdt>
         <w:sdtPr>

</xml_diff>

<commit_message>
Fix one bracket-column line still misaligned (stray hanging indent)
Paragraph 288F8258 (one of the blank lines in the ")" bracket column,
between the client name/A# line and "Respondents,") was the only one of
the 10 bracket lines carrying a leftover <w:ind w:left="2880"
w:hanging="2880"/> from the original document. A hanging indent makes
Word insert an implicit tab stop at the indent boundary (2880 twips),
which took priority over the explicit pos=6195 stop added in the
previous fix — so this one line's ")" landed at the indent's column
instead of lining up with the other 9. Removed the stray indent so it
resolves to the same explicit tab stop as every other bracket line.

Verified against the previous commit: only this paragraph changed.
validate_docx passes, XML is well-formed, and a fill with a rider case
(Bellio Calles, Maria Gabriella) round-trips correctly.
</commit_message>
<xml_diff>
--- a/plantillas/webex-motion/MOTION_FOR_WEBEX.docx
+++ b/plantillas/webex-motion/MOTION_FOR_WEBEX.docx
@@ -500,10 +500,9 @@
           <w:tab w:val="left" w:pos="6195"/>
         </w:tabs>
         <w:spacing w:line="276" w:lineRule="auto"/>
-        <w:ind w:left="2880" w:hanging="2880"/>
-        <w:rPr>
-          <w:rFonts w:ascii="Times New Roman" w:eastAsia="Times New Roman" w:hAnsi="Times New Roman" w:cs="Times New Roman"/>
-          <w:b/>
+        <w:jc w:val="both"/>
+        <w:rPr>
+          <w:rFonts w:ascii="Times New Roman" w:eastAsia="Times New Roman" w:hAnsi="Times New Roman" w:cs="Times New Roman"/>
           <w:sz w:val="24"/>
           <w:szCs w:val="24"/>
           <w:lang w:val="es-MX"/>

</xml_diff>

<commit_message>
Revert webex-motion section page breaks (kept signature + plural fixes)
The <w:pageBreakBefore/> per-section restructure ruined the template's
formatting in real Word (user report), so revert it. Rebuilt the .docx from
the original template applying only the baked-signature removal, restoring
the original page structure (filler-empty paragraphs, TOC-only page break).
The double-signature fix and the plural_riders mechanism are unchanged.
Recorded the tried-and-reverted decision in CLAUDE.md.

Co-Authored-By: Claude Opus 4.8 <noreply@anthropic.com>
Claude-Session: https://claude.ai/code/session_01SWKjmpLbnm4oMbZDEtfKhm
</commit_message>
<xml_diff>
--- a/plantillas/webex-motion/MOTION_FOR_WEBEX.docx
+++ b/plantillas/webex-motion/MOTION_FOR_WEBEX.docx
@@ -1068,6 +1068,424 @@
         <w:t xml:space="preserve"> </w:t>
       </w:r>
     </w:p>
+    <w:p>
+      <w:pPr>
+        <w:spacing w:line="240" w:lineRule="auto"/>
+        <w:rPr>
+          <w:rFonts w:ascii="Times New Roman" w:eastAsia="Times New Roman" w:hAnsi="Times New Roman" w:cs="Times New Roman"/>
+          <w:b/>
+          <w:sz w:val="24"/>
+          <w:szCs w:val="24"/>
+        </w:rPr>
+      </w:pPr>
+      <w:r>
+        <w:rPr>
+          <w:rFonts w:ascii="Times New Roman" w:eastAsia="Times New Roman" w:hAnsi="Times New Roman" w:cs="Times New Roman"/>
+          <w:b/>
+          <w:sz w:val="24"/>
+          <w:szCs w:val="24"/>
+        </w:rPr>
+        <w:tab/>
+      </w:r>
+    </w:p>
+    <w:p>
+      <w:pPr>
+        <w:spacing w:line="240" w:lineRule="auto"/>
+        <w:ind w:left="1440" w:hanging="1320"/>
+        <w:rPr>
+          <w:rFonts w:ascii="Times New Roman" w:eastAsia="Times New Roman" w:hAnsi="Times New Roman" w:cs="Times New Roman"/>
+          <w:sz w:val="24"/>
+          <w:szCs w:val="24"/>
+        </w:rPr>
+      </w:pPr>
+    </w:p>
+    <w:p>
+      <w:pPr>
+        <w:spacing w:line="240" w:lineRule="auto"/>
+        <w:ind w:left="1440" w:hanging="1320"/>
+        <w:rPr>
+          <w:rFonts w:ascii="Times New Roman" w:eastAsia="Times New Roman" w:hAnsi="Times New Roman" w:cs="Times New Roman"/>
+          <w:sz w:val="24"/>
+          <w:szCs w:val="24"/>
+        </w:rPr>
+      </w:pPr>
+    </w:p>
+    <w:p>
+      <w:pPr>
+        <w:pBdr>
+          <w:top w:val="nil"/>
+          <w:left w:val="nil"/>
+          <w:bottom w:val="nil"/>
+          <w:right w:val="nil"/>
+          <w:between w:val="nil"/>
+        </w:pBdr>
+        <w:spacing w:line="240" w:lineRule="auto"/>
+        <w:ind w:left="720"/>
+        <w:rPr>
+          <w:rFonts w:ascii="Times New Roman" w:eastAsia="Times New Roman" w:hAnsi="Times New Roman" w:cs="Times New Roman"/>
+          <w:b/>
+          <w:color w:val="000000"/>
+          <w:sz w:val="24"/>
+          <w:szCs w:val="24"/>
+        </w:rPr>
+      </w:pPr>
+    </w:p>
+    <w:p>
+      <w:pPr>
+        <w:spacing w:line="240" w:lineRule="auto"/>
+        <w:ind w:left="1440" w:hanging="1440"/>
+        <w:rPr>
+          <w:rFonts w:ascii="Times New Roman" w:eastAsia="Times New Roman" w:hAnsi="Times New Roman" w:cs="Times New Roman"/>
+          <w:b/>
+          <w:sz w:val="24"/>
+          <w:szCs w:val="24"/>
+        </w:rPr>
+      </w:pPr>
+      <w:r>
+        <w:rPr>
+          <w:rFonts w:ascii="Times New Roman" w:eastAsia="Times New Roman" w:hAnsi="Times New Roman" w:cs="Times New Roman"/>
+          <w:b/>
+          <w:sz w:val="24"/>
+          <w:szCs w:val="24"/>
+        </w:rPr>
+        <w:t xml:space="preserve"> </w:t>
+      </w:r>
+    </w:p>
+    <w:p>
+      <w:pPr>
+        <w:pBdr>
+          <w:top w:val="nil"/>
+          <w:left w:val="nil"/>
+          <w:bottom w:val="nil"/>
+          <w:right w:val="nil"/>
+          <w:between w:val="nil"/>
+        </w:pBdr>
+        <w:spacing w:line="240" w:lineRule="auto"/>
+        <w:ind w:left="2160" w:hanging="1440"/>
+        <w:rPr>
+          <w:rFonts w:ascii="Times New Roman" w:eastAsia="Times New Roman" w:hAnsi="Times New Roman" w:cs="Times New Roman"/>
+          <w:b/>
+          <w:color w:val="000000"/>
+          <w:sz w:val="24"/>
+          <w:szCs w:val="24"/>
+        </w:rPr>
+      </w:pPr>
+    </w:p>
+    <w:p>
+      <w:pPr>
+        <w:spacing w:line="240" w:lineRule="auto"/>
+        <w:rPr>
+          <w:rFonts w:ascii="Times New Roman" w:eastAsia="Times New Roman" w:hAnsi="Times New Roman" w:cs="Times New Roman"/>
+          <w:b/>
+          <w:sz w:val="24"/>
+          <w:szCs w:val="24"/>
+        </w:rPr>
+      </w:pPr>
+    </w:p>
+    <w:p>
+      <w:pPr>
+        <w:pBdr>
+          <w:top w:val="nil"/>
+          <w:left w:val="nil"/>
+          <w:bottom w:val="nil"/>
+          <w:right w:val="nil"/>
+          <w:between w:val="nil"/>
+        </w:pBdr>
+        <w:spacing w:line="240" w:lineRule="auto"/>
+        <w:ind w:left="720"/>
+        <w:rPr>
+          <w:rFonts w:ascii="Times New Roman" w:eastAsia="Times New Roman" w:hAnsi="Times New Roman" w:cs="Times New Roman"/>
+          <w:b/>
+          <w:color w:val="000000"/>
+          <w:sz w:val="24"/>
+          <w:szCs w:val="24"/>
+        </w:rPr>
+      </w:pPr>
+    </w:p>
+    <w:p>
+      <w:pPr>
+        <w:spacing w:line="240" w:lineRule="auto"/>
+        <w:rPr>
+          <w:rFonts w:ascii="Times New Roman" w:eastAsia="Times New Roman" w:hAnsi="Times New Roman" w:cs="Times New Roman"/>
+          <w:b/>
+          <w:sz w:val="24"/>
+          <w:szCs w:val="24"/>
+        </w:rPr>
+      </w:pPr>
+    </w:p>
+    <w:p>
+      <w:pPr>
+        <w:spacing w:line="240" w:lineRule="auto"/>
+        <w:rPr>
+          <w:rFonts w:ascii="Times New Roman" w:eastAsia="Times New Roman" w:hAnsi="Times New Roman" w:cs="Times New Roman"/>
+          <w:b/>
+          <w:sz w:val="24"/>
+          <w:szCs w:val="24"/>
+        </w:rPr>
+      </w:pPr>
+    </w:p>
+    <w:p>
+      <w:pPr>
+        <w:spacing w:line="240" w:lineRule="auto"/>
+        <w:rPr>
+          <w:rFonts w:ascii="Times New Roman" w:eastAsia="Times New Roman" w:hAnsi="Times New Roman" w:cs="Times New Roman"/>
+          <w:b/>
+          <w:sz w:val="24"/>
+          <w:szCs w:val="24"/>
+        </w:rPr>
+      </w:pPr>
+    </w:p>
+    <w:p>
+      <w:pPr>
+        <w:spacing w:line="240" w:lineRule="auto"/>
+        <w:rPr>
+          <w:rFonts w:ascii="Times New Roman" w:eastAsia="Times New Roman" w:hAnsi="Times New Roman" w:cs="Times New Roman"/>
+          <w:b/>
+          <w:sz w:val="24"/>
+          <w:szCs w:val="24"/>
+        </w:rPr>
+      </w:pPr>
+    </w:p>
+    <w:p>
+      <w:pPr>
+        <w:spacing w:line="240" w:lineRule="auto"/>
+        <w:rPr>
+          <w:rFonts w:ascii="Times New Roman" w:eastAsia="Times New Roman" w:hAnsi="Times New Roman" w:cs="Times New Roman"/>
+          <w:b/>
+          <w:sz w:val="36"/>
+          <w:szCs w:val="36"/>
+        </w:rPr>
+      </w:pPr>
+      <w:r>
+        <w:rPr>
+          <w:rFonts w:ascii="Times New Roman" w:eastAsia="Times New Roman" w:hAnsi="Times New Roman" w:cs="Times New Roman"/>
+          <w:b/>
+          <w:sz w:val="24"/>
+          <w:szCs w:val="24"/>
+        </w:rPr>
+        <w:tab/>
+        <w:tab/>
+        <w:tab/>
+      </w:r>
+      <w:r>
+        <w:rPr>
+          <w:rFonts w:ascii="Times New Roman" w:eastAsia="Times New Roman" w:hAnsi="Times New Roman" w:cs="Times New Roman"/>
+          <w:b/>
+          <w:sz w:val="36"/>
+          <w:szCs w:val="36"/>
+        </w:rPr>
+        <w:t xml:space="preserve"> </w:t>
+      </w:r>
+    </w:p>
+    <w:p>
+      <w:pPr>
+        <w:spacing w:line="240" w:lineRule="auto"/>
+        <w:rPr>
+          <w:rFonts w:ascii="Times New Roman" w:eastAsia="Times New Roman" w:hAnsi="Times New Roman" w:cs="Times New Roman"/>
+          <w:b/>
+          <w:sz w:val="36"/>
+          <w:szCs w:val="36"/>
+        </w:rPr>
+      </w:pPr>
+      <w:r>
+        <w:rPr>
+          <w:rFonts w:ascii="Times New Roman" w:eastAsia="Times New Roman" w:hAnsi="Times New Roman" w:cs="Times New Roman"/>
+          <w:b/>
+          <w:sz w:val="36"/>
+          <w:szCs w:val="36"/>
+        </w:rPr>
+        <w:t xml:space="preserve"> </w:t>
+      </w:r>
+    </w:p>
+    <w:p>
+      <w:pPr>
+        <w:spacing w:line="240" w:lineRule="auto"/>
+        <w:rPr>
+          <w:rFonts w:ascii="Times New Roman" w:eastAsia="Times New Roman" w:hAnsi="Times New Roman" w:cs="Times New Roman"/>
+          <w:b/>
+          <w:sz w:val="36"/>
+          <w:szCs w:val="36"/>
+          <w:u w:val="single"/>
+        </w:rPr>
+      </w:pPr>
+    </w:p>
+    <w:p>
+      <w:pPr>
+        <w:spacing w:line="240" w:lineRule="auto"/>
+        <w:rPr>
+          <w:rFonts w:ascii="Times New Roman" w:eastAsia="Times New Roman" w:hAnsi="Times New Roman" w:cs="Times New Roman"/>
+          <w:b/>
+          <w:sz w:val="40"/>
+          <w:szCs w:val="40"/>
+          <w:u w:val="single"/>
+        </w:rPr>
+      </w:pPr>
+      <w:r>
+        <w:rPr>
+          <w:rFonts w:ascii="Times New Roman" w:eastAsia="Times New Roman" w:hAnsi="Times New Roman" w:cs="Times New Roman"/>
+          <w:b/>
+          <w:sz w:val="24"/>
+          <w:szCs w:val="24"/>
+        </w:rPr>
+        <w:tab/>
+        <w:tab/>
+        <w:tab/>
+        <w:tab/>
+        <w:tab/>
+        <w:tab/>
+        <w:tab/>
+        <w:tab/>
+      </w:r>
+      <w:r>
+        <w:rPr>
+          <w:rFonts w:ascii="Times New Roman" w:eastAsia="Times New Roman" w:hAnsi="Times New Roman" w:cs="Times New Roman"/>
+          <w:b/>
+          <w:sz w:val="40"/>
+          <w:szCs w:val="40"/>
+        </w:rPr>
+        <w:t xml:space="preserve">     </w:t>
+      </w:r>
+    </w:p>
+    <w:p>
+      <w:pPr>
+        <w:spacing w:line="240" w:lineRule="auto"/>
+        <w:rPr>
+          <w:rFonts w:ascii="Times New Roman" w:eastAsia="Times New Roman" w:hAnsi="Times New Roman" w:cs="Times New Roman"/>
+          <w:b/>
+          <w:sz w:val="24"/>
+          <w:szCs w:val="24"/>
+        </w:rPr>
+      </w:pPr>
+    </w:p>
+    <w:p>
+      <w:pPr>
+        <w:spacing w:line="240" w:lineRule="auto"/>
+        <w:rPr>
+          <w:rFonts w:ascii="Times New Roman" w:eastAsia="Times New Roman" w:hAnsi="Times New Roman" w:cs="Times New Roman"/>
+          <w:b/>
+          <w:sz w:val="24"/>
+          <w:szCs w:val="24"/>
+        </w:rPr>
+      </w:pPr>
+    </w:p>
+    <w:p>
+      <w:pPr>
+        <w:spacing w:line="240" w:lineRule="auto"/>
+        <w:rPr>
+          <w:rFonts w:ascii="Times New Roman" w:eastAsia="Times New Roman" w:hAnsi="Times New Roman" w:cs="Times New Roman"/>
+          <w:b/>
+          <w:sz w:val="24"/>
+          <w:szCs w:val="24"/>
+        </w:rPr>
+      </w:pPr>
+    </w:p>
+    <w:p>
+      <w:pPr>
+        <w:spacing w:line="240" w:lineRule="auto"/>
+        <w:rPr>
+          <w:rFonts w:ascii="Times New Roman" w:eastAsia="Times New Roman" w:hAnsi="Times New Roman" w:cs="Times New Roman"/>
+          <w:b/>
+          <w:sz w:val="24"/>
+          <w:szCs w:val="24"/>
+        </w:rPr>
+      </w:pPr>
+    </w:p>
+    <w:p>
+      <w:pPr>
+        <w:spacing w:line="240" w:lineRule="auto"/>
+        <w:rPr>
+          <w:rFonts w:ascii="Times New Roman" w:eastAsia="Times New Roman" w:hAnsi="Times New Roman" w:cs="Times New Roman"/>
+          <w:b/>
+          <w:sz w:val="24"/>
+          <w:szCs w:val="24"/>
+        </w:rPr>
+      </w:pPr>
+    </w:p>
+    <w:p>
+      <w:pPr>
+        <w:spacing w:line="240" w:lineRule="auto"/>
+        <w:rPr>
+          <w:rFonts w:ascii="Times New Roman" w:eastAsia="Times New Roman" w:hAnsi="Times New Roman" w:cs="Times New Roman"/>
+          <w:b/>
+          <w:sz w:val="24"/>
+          <w:szCs w:val="24"/>
+        </w:rPr>
+      </w:pPr>
+    </w:p>
+    <w:p>
+      <w:pPr>
+        <w:spacing w:line="240" w:lineRule="auto"/>
+        <w:rPr>
+          <w:rFonts w:ascii="Times New Roman" w:eastAsia="Times New Roman" w:hAnsi="Times New Roman" w:cs="Times New Roman"/>
+          <w:b/>
+          <w:sz w:val="24"/>
+          <w:szCs w:val="24"/>
+        </w:rPr>
+      </w:pPr>
+    </w:p>
+    <w:p>
+      <w:pPr>
+        <w:spacing w:line="240" w:lineRule="auto"/>
+        <w:rPr>
+          <w:rFonts w:ascii="Times New Roman" w:eastAsia="Times New Roman" w:hAnsi="Times New Roman" w:cs="Times New Roman"/>
+          <w:b/>
+          <w:sz w:val="24"/>
+          <w:szCs w:val="24"/>
+        </w:rPr>
+      </w:pPr>
+    </w:p>
+    <w:p>
+      <w:pPr>
+        <w:spacing w:line="240" w:lineRule="auto"/>
+        <w:rPr>
+          <w:rFonts w:ascii="Times New Roman" w:eastAsia="Times New Roman" w:hAnsi="Times New Roman" w:cs="Times New Roman"/>
+          <w:b/>
+          <w:sz w:val="24"/>
+          <w:szCs w:val="24"/>
+        </w:rPr>
+      </w:pPr>
+    </w:p>
+    <w:p>
+      <w:pPr>
+        <w:spacing w:line="240" w:lineRule="auto"/>
+        <w:rPr>
+          <w:rFonts w:ascii="Times New Roman" w:eastAsia="Times New Roman" w:hAnsi="Times New Roman" w:cs="Times New Roman"/>
+          <w:b/>
+          <w:sz w:val="24"/>
+          <w:szCs w:val="24"/>
+        </w:rPr>
+      </w:pPr>
+    </w:p>
+    <w:p>
+      <w:pPr>
+        <w:spacing w:line="240" w:lineRule="auto"/>
+        <w:rPr>
+          <w:rFonts w:ascii="Times New Roman" w:eastAsia="Times New Roman" w:hAnsi="Times New Roman" w:cs="Times New Roman"/>
+          <w:b/>
+          <w:sz w:val="24"/>
+          <w:szCs w:val="24"/>
+        </w:rPr>
+      </w:pPr>
+    </w:p>
+    <w:p>
+      <w:pPr>
+        <w:spacing w:line="240" w:lineRule="auto"/>
+        <w:rPr>
+          <w:rFonts w:ascii="Times New Roman" w:eastAsia="Times New Roman" w:hAnsi="Times New Roman" w:cs="Times New Roman"/>
+          <w:b/>
+          <w:sz w:val="24"/>
+          <w:szCs w:val="24"/>
+        </w:rPr>
+        <w:sectPr>
+          <w:headerReference w:type="default" r:id="rId7"/>
+          <w:footerReference w:type="default" r:id="rId8"/>
+          <w:pgSz w:w="12240" w:h="15840"/>
+          <w:pgMar w:top="1440" w:right="1440" w:bottom="1440" w:left="1440" w:header="720" w:footer="432" w:gutter="0"/>
+          <w:pgNumType w:start="1"/>
+          <w:cols w:space="720"/>
+        </w:sectPr>
+      </w:pPr>
+    </w:p>
     <w:sdt>
       <w:sdtPr>
         <w:rPr>
@@ -1093,7 +1511,6 @@
     </w:sdt>
     <w:p>
       <w:pPr>
-        <w:pageBreakBefore/>
         <w:spacing w:line="240" w:lineRule="auto"/>
         <w:rPr>
           <w:rFonts w:ascii="Times New Roman" w:hAnsi="Times New Roman"/>
@@ -2323,7 +2740,164 @@
     </w:p>
     <w:p>
       <w:pPr>
-        <w:pageBreakBefore/>
+        <w:spacing w:line="276" w:lineRule="auto"/>
+        <w:jc w:val="both"/>
+        <w:rPr>
+          <w:rFonts w:ascii="Times New Roman" w:eastAsia="Times New Roman" w:hAnsi="Times New Roman" w:cs="Times New Roman"/>
+          <w:sz w:val="24"/>
+          <w:szCs w:val="24"/>
+        </w:rPr>
+      </w:pPr>
+    </w:p>
+    <w:p>
+      <w:pPr>
+        <w:spacing w:line="276" w:lineRule="auto"/>
+        <w:jc w:val="both"/>
+        <w:rPr>
+          <w:rFonts w:ascii="Times New Roman" w:eastAsia="Times New Roman" w:hAnsi="Times New Roman" w:cs="Times New Roman"/>
+          <w:sz w:val="24"/>
+          <w:szCs w:val="24"/>
+        </w:rPr>
+      </w:pPr>
+    </w:p>
+    <w:p>
+      <w:pPr>
+        <w:spacing w:line="276" w:lineRule="auto"/>
+        <w:jc w:val="both"/>
+        <w:rPr>
+          <w:rFonts w:ascii="Times New Roman" w:eastAsia="Times New Roman" w:hAnsi="Times New Roman" w:cs="Times New Roman"/>
+          <w:sz w:val="24"/>
+          <w:szCs w:val="24"/>
+        </w:rPr>
+      </w:pPr>
+    </w:p>
+    <w:p>
+      <w:pPr>
+        <w:spacing w:line="276" w:lineRule="auto"/>
+        <w:jc w:val="both"/>
+        <w:rPr>
+          <w:rFonts w:ascii="Times New Roman" w:eastAsia="Times New Roman" w:hAnsi="Times New Roman" w:cs="Times New Roman"/>
+          <w:sz w:val="24"/>
+          <w:szCs w:val="24"/>
+        </w:rPr>
+      </w:pPr>
+    </w:p>
+    <w:p>
+      <w:pPr>
+        <w:spacing w:line="276" w:lineRule="auto"/>
+        <w:jc w:val="both"/>
+        <w:rPr>
+          <w:rFonts w:ascii="Times New Roman" w:eastAsia="Times New Roman" w:hAnsi="Times New Roman" w:cs="Times New Roman"/>
+          <w:sz w:val="24"/>
+          <w:szCs w:val="24"/>
+        </w:rPr>
+      </w:pPr>
+    </w:p>
+    <w:p>
+      <w:pPr>
+        <w:tabs>
+          <w:tab w:val="left" w:pos="720"/>
+          <w:tab w:val="left" w:pos="1440"/>
+          <w:tab w:val="left" w:pos="2160"/>
+          <w:tab w:val="left" w:pos="2880"/>
+          <w:tab w:val="left" w:pos="3600"/>
+          <w:tab w:val="left" w:pos="4320"/>
+          <w:tab w:val="left" w:pos="6180"/>
+        </w:tabs>
+        <w:spacing w:line="240" w:lineRule="auto"/>
+        <w:rPr>
+          <w:rFonts w:ascii="Times New Roman" w:eastAsia="Times New Roman" w:hAnsi="Times New Roman" w:cs="Times New Roman"/>
+          <w:sz w:val="24"/>
+          <w:szCs w:val="24"/>
+        </w:rPr>
+      </w:pPr>
+      <w:r>
+        <w:rPr>
+          <w:rFonts w:ascii="Times New Roman" w:eastAsia="Times New Roman" w:hAnsi="Times New Roman" w:cs="Times New Roman"/>
+          <w:sz w:val="24"/>
+          <w:szCs w:val="24"/>
+        </w:rPr>
+        <w:tab/>
+      </w:r>
+    </w:p>
+    <w:p>
+      <w:pPr>
+        <w:spacing w:line="240" w:lineRule="auto"/>
+        <w:rPr>
+          <w:rFonts w:ascii="Times New Roman" w:eastAsia="Times New Roman" w:hAnsi="Times New Roman" w:cs="Times New Roman"/>
+          <w:sz w:val="24"/>
+          <w:szCs w:val="24"/>
+        </w:rPr>
+      </w:pPr>
+    </w:p>
+    <w:p>
+      <w:pPr>
+        <w:jc w:val="both"/>
+        <w:rPr>
+          <w:rFonts w:ascii="Times New Roman" w:eastAsia="Times New Roman" w:hAnsi="Times New Roman" w:cs="Times New Roman"/>
+          <w:sz w:val="24"/>
+          <w:szCs w:val="24"/>
+        </w:rPr>
+      </w:pPr>
+    </w:p>
+    <w:p>
+      <w:pPr>
+        <w:jc w:val="both"/>
+        <w:rPr>
+          <w:rFonts w:ascii="Times New Roman" w:eastAsia="Times New Roman" w:hAnsi="Times New Roman" w:cs="Times New Roman"/>
+          <w:sz w:val="24"/>
+          <w:szCs w:val="24"/>
+        </w:rPr>
+      </w:pPr>
+    </w:p>
+    <w:p>
+      <w:pPr>
+        <w:jc w:val="both"/>
+        <w:rPr>
+          <w:rFonts w:ascii="Times New Roman" w:eastAsia="Times New Roman" w:hAnsi="Times New Roman" w:cs="Times New Roman"/>
+          <w:sz w:val="24"/>
+          <w:szCs w:val="24"/>
+        </w:rPr>
+      </w:pPr>
+    </w:p>
+    <w:p>
+      <w:pPr>
+        <w:jc w:val="both"/>
+        <w:rPr>
+          <w:rFonts w:ascii="Times New Roman" w:eastAsia="Times New Roman" w:hAnsi="Times New Roman" w:cs="Times New Roman"/>
+          <w:sz w:val="24"/>
+          <w:szCs w:val="24"/>
+        </w:rPr>
+      </w:pPr>
+    </w:p>
+    <w:p>
+      <w:pPr>
+        <w:tabs>
+          <w:tab w:val="left" w:pos="-720"/>
+        </w:tabs>
+        <w:jc w:val="both"/>
+        <w:rPr>
+          <w:rFonts w:ascii="Times New Roman" w:eastAsia="Times New Roman" w:hAnsi="Times New Roman" w:cs="Times New Roman"/>
+          <w:sz w:val="24"/>
+          <w:szCs w:val="24"/>
+        </w:rPr>
+      </w:pPr>
+    </w:p>
+    <w:p>
+      <w:pPr>
+        <w:tabs>
+          <w:tab w:val="left" w:pos="-720"/>
+        </w:tabs>
+        <w:jc w:val="both"/>
+        <w:rPr>
+          <w:rFonts w:ascii="Times New Roman" w:eastAsia="Times New Roman" w:hAnsi="Times New Roman" w:cs="Times New Roman"/>
+          <w:sz w:val="24"/>
+          <w:szCs w:val="24"/>
+        </w:rPr>
+      </w:pPr>
+    </w:p>
+    <w:p>
+      <w:pPr>
         <w:spacing w:line="240" w:lineRule="auto"/>
         <w:jc w:val="center"/>
         <w:rPr>
@@ -3172,7 +3746,6 @@
     </w:sdt>
     <w:p>
       <w:pPr>
-        <w:pageBreakBefore/>
         <w:spacing w:line="240" w:lineRule="auto"/>
         <w:rPr>
           <w:rFonts w:ascii="Times New Roman" w:eastAsia="Times New Roman" w:hAnsi="Times New Roman" w:cs="Times New Roman"/>

</xml_diff>

<commit_message>
webex-motion: quitar un párrafo vacío tras el bloque de firma (editado a mano por el usuario en Word)
El usuario abrió la plantilla en Word y eliminó uno de los párrafos vacíos
que seguían a "Dated:... Respectfully Submitted," / firma del abogado, para
ayudar a que el contenido quepa en menos páginas. A diferencia del intento
anterior de saltos de página reales (revertido, ver CLAUDE.md), esta edición
se hizo con render real en Word, no a ciegas por estructura XML.

Verificado: sin firmas quemadas, plurales con riders y llenado de campos
siguen funcionando correctamente tras el cambio.
</commit_message>
<xml_diff>
--- a/plantillas/webex-motion/MOTION_FOR_WEBEX.docx
+++ b/plantillas/webex-motion/MOTION_FOR_WEBEX.docx
@@ -64,7 +64,7 @@
           <w:sz w:val="24"/>
           <w:szCs w:val="24"/>
         </w:rPr>
-        <w:t xml:space="preserve">3250 Wilshire Blvd., Suite 2100</w:t>
+        <w:t>3250 Wilshire Blvd., Suite 2100</w:t>
       </w:r>
     </w:p>
     <w:p>
@@ -313,7 +313,14 @@
           <w:sz w:val="24"/>
           <w:szCs w:val="24"/>
         </w:rPr>
-        <w:t xml:space="preserve">In the Matter of:</w:t>
+        <w:t>In the Matter of:</w:t>
+      </w:r>
+      <w:r>
+        <w:rPr>
+          <w:rFonts w:ascii="Times New Roman" w:eastAsia="Times New Roman" w:hAnsi="Times New Roman" w:cs="Times New Roman"/>
+          <w:sz w:val="24"/>
+          <w:szCs w:val="24"/>
+        </w:rPr>
         <w:tab/>
         <w:t>)</w:t>
       </w:r>
@@ -329,15 +336,13 @@
           <w:rFonts w:ascii="Times New Roman" w:eastAsia="Times New Roman" w:hAnsi="Times New Roman" w:cs="Times New Roman"/>
           <w:sz w:val="24"/>
           <w:szCs w:val="24"/>
-          <w:lang w:val="es-MX"/>
-        </w:rPr>
-      </w:pPr>
-      <w:r>
-        <w:rPr>
-          <w:rFonts w:ascii="Times New Roman" w:eastAsia="Times New Roman" w:hAnsi="Times New Roman" w:cs="Times New Roman"/>
-          <w:sz w:val="24"/>
-          <w:szCs w:val="24"/>
-          <w:lang w:val="es-MX"/>
+        </w:rPr>
+      </w:pPr>
+      <w:r>
+        <w:rPr>
+          <w:rFonts w:ascii="Times New Roman" w:eastAsia="Times New Roman" w:hAnsi="Times New Roman" w:cs="Times New Roman"/>
+          <w:sz w:val="24"/>
+          <w:szCs w:val="24"/>
         </w:rPr>
         <w:tab/>
         <w:t>)</w:t>
@@ -354,15 +359,13 @@
           <w:rFonts w:ascii="Times New Roman" w:eastAsia="Times New Roman" w:hAnsi="Times New Roman" w:cs="Times New Roman"/>
           <w:sz w:val="24"/>
           <w:szCs w:val="24"/>
-          <w:lang w:val="es-MX"/>
-        </w:rPr>
-      </w:pPr>
-      <w:r>
-        <w:rPr>
-          <w:rFonts w:ascii="Times New Roman" w:eastAsia="Times New Roman" w:hAnsi="Times New Roman" w:cs="Times New Roman"/>
-          <w:sz w:val="24"/>
-          <w:szCs w:val="24"/>
-          <w:lang w:val="es-MX"/>
+        </w:rPr>
+      </w:pPr>
+      <w:r>
+        <w:rPr>
+          <w:rFonts w:ascii="Times New Roman" w:eastAsia="Times New Roman" w:hAnsi="Times New Roman" w:cs="Times New Roman"/>
+          <w:sz w:val="24"/>
+          <w:szCs w:val="24"/>
         </w:rPr>
         <w:tab/>
         <w:t>)</w:t>
@@ -379,15 +382,13 @@
           <w:rFonts w:ascii="Times New Roman" w:eastAsia="Times New Roman" w:hAnsi="Times New Roman" w:cs="Times New Roman"/>
           <w:sz w:val="24"/>
           <w:szCs w:val="24"/>
-          <w:lang w:val="es-MX"/>
-        </w:rPr>
-      </w:pPr>
-      <w:r>
-        <w:rPr>
-          <w:rFonts w:ascii="Times New Roman" w:eastAsia="Times New Roman" w:hAnsi="Times New Roman" w:cs="Times New Roman"/>
-          <w:sz w:val="24"/>
-          <w:szCs w:val="24"/>
-          <w:lang w:val="es-MX"/>
+        </w:rPr>
+      </w:pPr>
+      <w:r>
+        <w:rPr>
+          <w:rFonts w:ascii="Times New Roman" w:eastAsia="Times New Roman" w:hAnsi="Times New Roman" w:cs="Times New Roman"/>
+          <w:sz w:val="24"/>
+          <w:szCs w:val="24"/>
         </w:rPr>
         <w:tab/>
         <w:t>)</w:t>
@@ -405,7 +406,6 @@
           <w:rFonts w:ascii="Times New Roman" w:eastAsia="Times New Roman" w:hAnsi="Times New Roman" w:cs="Times New Roman"/>
           <w:sz w:val="24"/>
           <w:szCs w:val="24"/>
-          <w:lang w:val="es-MX"/>
         </w:rPr>
       </w:pPr>
       <w:sdt>
@@ -424,7 +424,7 @@
               <w:sz w:val="24"/>
               <w:szCs w:val="24"/>
             </w:rPr>
-            <w:t xml:space="preserve">Argel Chavez, Eva Sandrith</w:t>
+            <w:t>Argel Chavez, Eva Sandrith</w:t>
           </w:r>
         </w:sdtContent>
       </w:sdt>
@@ -464,7 +464,7 @@
               <w:sz w:val="24"/>
               <w:szCs w:val="24"/>
             </w:rPr>
-            <w:t xml:space="preserve">245-540-580</w:t>
+            <w:t>245-540-580</w:t>
           </w:r>
         </w:sdtContent>
       </w:sdt>
@@ -480,15 +480,13 @@
           <w:rFonts w:ascii="Times New Roman" w:eastAsia="Times New Roman" w:hAnsi="Times New Roman" w:cs="Times New Roman"/>
           <w:sz w:val="24"/>
           <w:szCs w:val="24"/>
-          <w:lang w:val="es-MX"/>
-        </w:rPr>
-      </w:pPr>
-      <w:r>
-        <w:rPr>
-          <w:rFonts w:ascii="Times New Roman" w:eastAsia="Times New Roman" w:hAnsi="Times New Roman" w:cs="Times New Roman"/>
-          <w:sz w:val="24"/>
-          <w:szCs w:val="24"/>
-          <w:lang w:val="es-MX"/>
+        </w:rPr>
+      </w:pPr>
+      <w:r>
+        <w:rPr>
+          <w:rFonts w:ascii="Times New Roman" w:eastAsia="Times New Roman" w:hAnsi="Times New Roman" w:cs="Times New Roman"/>
+          <w:sz w:val="24"/>
+          <w:szCs w:val="24"/>
         </w:rPr>
         <w:tab/>
         <w:t>)</w:t>
@@ -505,15 +503,13 @@
           <w:rFonts w:ascii="Times New Roman" w:eastAsia="Times New Roman" w:hAnsi="Times New Roman" w:cs="Times New Roman"/>
           <w:sz w:val="24"/>
           <w:szCs w:val="24"/>
-          <w:lang w:val="es-MX"/>
-        </w:rPr>
-      </w:pPr>
-      <w:r>
-        <w:rPr>
-          <w:rFonts w:ascii="Times New Roman" w:eastAsia="Times New Roman" w:hAnsi="Times New Roman" w:cs="Times New Roman"/>
-          <w:sz w:val="24"/>
-          <w:szCs w:val="24"/>
-          <w:lang w:val="es-MX"/>
+        </w:rPr>
+      </w:pPr>
+      <w:r>
+        <w:rPr>
+          <w:rFonts w:ascii="Times New Roman" w:eastAsia="Times New Roman" w:hAnsi="Times New Roman" w:cs="Times New Roman"/>
+          <w:sz w:val="24"/>
+          <w:szCs w:val="24"/>
         </w:rPr>
         <w:tab/>
         <w:t>)</w:t>
@@ -529,17 +525,22 @@
           <w:rFonts w:ascii="Times New Roman" w:eastAsia="Times New Roman" w:hAnsi="Times New Roman" w:cs="Times New Roman"/>
           <w:sz w:val="24"/>
           <w:szCs w:val="24"/>
-          <w:lang w:val="es-MX"/>
-        </w:rPr>
-      </w:pPr>
-      <w:r>
-        <w:rPr>
-          <w:rFonts w:ascii="Times New Roman" w:eastAsia="Times New Roman" w:hAnsi="Times New Roman" w:cs="Times New Roman"/>
-          <w:sz w:val="24"/>
-          <w:szCs w:val="24"/>
-          <w:lang w:val="es-MX"/>
-        </w:rPr>
-        <w:t xml:space="preserve">Respondents,</w:t>
+        </w:rPr>
+      </w:pPr>
+      <w:r>
+        <w:rPr>
+          <w:rFonts w:ascii="Times New Roman" w:eastAsia="Times New Roman" w:hAnsi="Times New Roman" w:cs="Times New Roman"/>
+          <w:sz w:val="24"/>
+          <w:szCs w:val="24"/>
+        </w:rPr>
+        <w:t>Respondents,</w:t>
+      </w:r>
+      <w:r>
+        <w:rPr>
+          <w:rFonts w:ascii="Times New Roman" w:eastAsia="Times New Roman" w:hAnsi="Times New Roman" w:cs="Times New Roman"/>
+          <w:sz w:val="24"/>
+          <w:szCs w:val="24"/>
+        </w:rPr>
         <w:tab/>
         <w:t>)</w:t>
       </w:r>
@@ -562,7 +563,6 @@
           <w:rFonts w:ascii="Times New Roman" w:eastAsia="Times New Roman" w:hAnsi="Times New Roman" w:cs="Times New Roman"/>
           <w:sz w:val="24"/>
           <w:szCs w:val="24"/>
-          <w:lang w:val="es-MX"/>
         </w:rPr>
         <w:tab/>
         <w:t>)</w:t>
@@ -720,7 +720,7 @@
               <w:sz w:val="22"/>
               <w:szCs w:val="22"/>
             </w:rPr>
-            <w:t xml:space="preserve">Wright, Virna A.</w:t>
+            <w:t>Wright, Virna A.</w:t>
           </w:r>
         </w:sdtContent>
       </w:sdt>
@@ -760,7 +760,7 @@
               <w:sz w:val="22"/>
               <w:szCs w:val="22"/>
             </w:rPr>
-            <w:t xml:space="preserve">August 19, 2026 at 8:30 AM</w:t>
+            <w:t>August 19, 2026 at 8:30 AM</w:t>
           </w:r>
         </w:sdtContent>
       </w:sdt>
@@ -1001,14 +1001,78 @@
           <w:szCs w:val="24"/>
         </w:rPr>
         <w:tab/>
+      </w:r>
+      <w:r>
+        <w:rPr>
+          <w:rFonts w:ascii="Times New Roman" w:eastAsia="Times New Roman" w:hAnsi="Times New Roman" w:cs="Times New Roman"/>
+          <w:b/>
+          <w:sz w:val="24"/>
+          <w:szCs w:val="24"/>
+        </w:rPr>
         <w:tab/>
         <w:t>DESCRIPTION</w:t>
-        <w:tab/>
-        <w:tab/>
-        <w:tab/>
-        <w:tab/>
-        <w:tab/>
-        <w:tab/>
+      </w:r>
+      <w:r>
+        <w:rPr>
+          <w:rFonts w:ascii="Times New Roman" w:eastAsia="Times New Roman" w:hAnsi="Times New Roman" w:cs="Times New Roman"/>
+          <w:b/>
+          <w:sz w:val="24"/>
+          <w:szCs w:val="24"/>
+        </w:rPr>
+        <w:tab/>
+      </w:r>
+      <w:r>
+        <w:rPr>
+          <w:rFonts w:ascii="Times New Roman" w:eastAsia="Times New Roman" w:hAnsi="Times New Roman" w:cs="Times New Roman"/>
+          <w:b/>
+          <w:sz w:val="24"/>
+          <w:szCs w:val="24"/>
+        </w:rPr>
+        <w:tab/>
+      </w:r>
+      <w:r>
+        <w:rPr>
+          <w:rFonts w:ascii="Times New Roman" w:eastAsia="Times New Roman" w:hAnsi="Times New Roman" w:cs="Times New Roman"/>
+          <w:b/>
+          <w:sz w:val="24"/>
+          <w:szCs w:val="24"/>
+        </w:rPr>
+        <w:tab/>
+      </w:r>
+      <w:r>
+        <w:rPr>
+          <w:rFonts w:ascii="Times New Roman" w:eastAsia="Times New Roman" w:hAnsi="Times New Roman" w:cs="Times New Roman"/>
+          <w:b/>
+          <w:sz w:val="24"/>
+          <w:szCs w:val="24"/>
+        </w:rPr>
+        <w:tab/>
+      </w:r>
+      <w:r>
+        <w:rPr>
+          <w:rFonts w:ascii="Times New Roman" w:eastAsia="Times New Roman" w:hAnsi="Times New Roman" w:cs="Times New Roman"/>
+          <w:b/>
+          <w:sz w:val="24"/>
+          <w:szCs w:val="24"/>
+        </w:rPr>
+        <w:tab/>
+      </w:r>
+      <w:r>
+        <w:rPr>
+          <w:rFonts w:ascii="Times New Roman" w:eastAsia="Times New Roman" w:hAnsi="Times New Roman" w:cs="Times New Roman"/>
+          <w:b/>
+          <w:sz w:val="24"/>
+          <w:szCs w:val="24"/>
+        </w:rPr>
+        <w:tab/>
+      </w:r>
+      <w:r>
+        <w:rPr>
+          <w:rFonts w:ascii="Times New Roman" w:eastAsia="Times New Roman" w:hAnsi="Times New Roman" w:cs="Times New Roman"/>
+          <w:b/>
+          <w:sz w:val="24"/>
+          <w:szCs w:val="24"/>
+        </w:rPr>
         <w:tab/>
       </w:r>
     </w:p>
@@ -1051,7 +1115,23 @@
           <w:szCs w:val="24"/>
         </w:rPr>
         <w:t xml:space="preserve">  </w:t>
-        <w:tab/>
+      </w:r>
+      <w:r>
+        <w:rPr>
+          <w:rFonts w:ascii="Times New Roman" w:eastAsia="Times New Roman" w:hAnsi="Times New Roman" w:cs="Times New Roman"/>
+          <w:b/>
+          <w:sz w:val="24"/>
+          <w:szCs w:val="24"/>
+        </w:rPr>
+        <w:tab/>
+      </w:r>
+      <w:r>
+        <w:rPr>
+          <w:rFonts w:ascii="Times New Roman" w:eastAsia="Times New Roman" w:hAnsi="Times New Roman" w:cs="Times New Roman"/>
+          <w:b/>
+          <w:sz w:val="24"/>
+          <w:szCs w:val="24"/>
+        </w:rPr>
         <w:tab/>
       </w:r>
       <w:r>
@@ -1061,9 +1141,37 @@
           <w:szCs w:val="24"/>
         </w:rPr>
         <w:t xml:space="preserve">Motion for Webex Appearance               </w:t>
-        <w:tab/>
-        <w:tab/>
-        <w:tab/>
+      </w:r>
+      <w:r>
+        <w:rPr>
+          <w:rFonts w:ascii="Times New Roman" w:eastAsia="Times New Roman" w:hAnsi="Times New Roman" w:cs="Times New Roman"/>
+          <w:sz w:val="24"/>
+          <w:szCs w:val="24"/>
+        </w:rPr>
+        <w:tab/>
+      </w:r>
+      <w:r>
+        <w:rPr>
+          <w:rFonts w:ascii="Times New Roman" w:eastAsia="Times New Roman" w:hAnsi="Times New Roman" w:cs="Times New Roman"/>
+          <w:sz w:val="24"/>
+          <w:szCs w:val="24"/>
+        </w:rPr>
+        <w:tab/>
+      </w:r>
+      <w:r>
+        <w:rPr>
+          <w:rFonts w:ascii="Times New Roman" w:eastAsia="Times New Roman" w:hAnsi="Times New Roman" w:cs="Times New Roman"/>
+          <w:sz w:val="24"/>
+          <w:szCs w:val="24"/>
+        </w:rPr>
+        <w:tab/>
+      </w:r>
+      <w:r>
+        <w:rPr>
+          <w:rFonts w:ascii="Times New Roman" w:eastAsia="Times New Roman" w:hAnsi="Times New Roman" w:cs="Times New Roman"/>
+          <w:sz w:val="24"/>
+          <w:szCs w:val="24"/>
+        </w:rPr>
         <w:tab/>
         <w:t xml:space="preserve"> </w:t>
       </w:r>
@@ -1264,7 +1372,23 @@
           <w:szCs w:val="24"/>
         </w:rPr>
         <w:tab/>
-        <w:tab/>
+      </w:r>
+      <w:r>
+        <w:rPr>
+          <w:rFonts w:ascii="Times New Roman" w:eastAsia="Times New Roman" w:hAnsi="Times New Roman" w:cs="Times New Roman"/>
+          <w:b/>
+          <w:sz w:val="24"/>
+          <w:szCs w:val="24"/>
+        </w:rPr>
+        <w:tab/>
+      </w:r>
+      <w:r>
+        <w:rPr>
+          <w:rFonts w:ascii="Times New Roman" w:eastAsia="Times New Roman" w:hAnsi="Times New Roman" w:cs="Times New Roman"/>
+          <w:b/>
+          <w:sz w:val="24"/>
+          <w:szCs w:val="24"/>
+        </w:rPr>
         <w:tab/>
       </w:r>
       <w:r>
@@ -1328,12 +1452,68 @@
           <w:szCs w:val="24"/>
         </w:rPr>
         <w:tab/>
-        <w:tab/>
-        <w:tab/>
-        <w:tab/>
-        <w:tab/>
-        <w:tab/>
-        <w:tab/>
+      </w:r>
+      <w:r>
+        <w:rPr>
+          <w:rFonts w:ascii="Times New Roman" w:eastAsia="Times New Roman" w:hAnsi="Times New Roman" w:cs="Times New Roman"/>
+          <w:b/>
+          <w:sz w:val="24"/>
+          <w:szCs w:val="24"/>
+        </w:rPr>
+        <w:tab/>
+      </w:r>
+      <w:r>
+        <w:rPr>
+          <w:rFonts w:ascii="Times New Roman" w:eastAsia="Times New Roman" w:hAnsi="Times New Roman" w:cs="Times New Roman"/>
+          <w:b/>
+          <w:sz w:val="24"/>
+          <w:szCs w:val="24"/>
+        </w:rPr>
+        <w:tab/>
+      </w:r>
+      <w:r>
+        <w:rPr>
+          <w:rFonts w:ascii="Times New Roman" w:eastAsia="Times New Roman" w:hAnsi="Times New Roman" w:cs="Times New Roman"/>
+          <w:b/>
+          <w:sz w:val="24"/>
+          <w:szCs w:val="24"/>
+        </w:rPr>
+        <w:tab/>
+      </w:r>
+      <w:r>
+        <w:rPr>
+          <w:rFonts w:ascii="Times New Roman" w:eastAsia="Times New Roman" w:hAnsi="Times New Roman" w:cs="Times New Roman"/>
+          <w:b/>
+          <w:sz w:val="24"/>
+          <w:szCs w:val="24"/>
+        </w:rPr>
+        <w:tab/>
+      </w:r>
+      <w:r>
+        <w:rPr>
+          <w:rFonts w:ascii="Times New Roman" w:eastAsia="Times New Roman" w:hAnsi="Times New Roman" w:cs="Times New Roman"/>
+          <w:b/>
+          <w:sz w:val="24"/>
+          <w:szCs w:val="24"/>
+        </w:rPr>
+        <w:tab/>
+      </w:r>
+      <w:r>
+        <w:rPr>
+          <w:rFonts w:ascii="Times New Roman" w:eastAsia="Times New Roman" w:hAnsi="Times New Roman" w:cs="Times New Roman"/>
+          <w:b/>
+          <w:sz w:val="24"/>
+          <w:szCs w:val="24"/>
+        </w:rPr>
+        <w:tab/>
+      </w:r>
+      <w:r>
+        <w:rPr>
+          <w:rFonts w:ascii="Times New Roman" w:eastAsia="Times New Roman" w:hAnsi="Times New Roman" w:cs="Times New Roman"/>
+          <w:b/>
+          <w:sz w:val="24"/>
+          <w:szCs w:val="24"/>
+        </w:rPr>
         <w:tab/>
       </w:r>
       <w:r>
@@ -1548,7 +1728,7 @@
           <w:sz w:val="24"/>
           <w:szCs w:val="24"/>
         </w:rPr>
-        <w:t xml:space="preserve">3250 Wilshire Blvd., Suite 2100</w:t>
+        <w:t>3250 Wilshire Blvd., Suite 2100</w:t>
       </w:r>
     </w:p>
     <w:p>
@@ -1929,9 +2109,6 @@
           </w:p>
           <w:p>
             <w:pPr>
-              <w:tabs>
-                <w:tab w:val="right" w:pos="9300"/>
-              </w:tabs>
               <w:pBdr>
                 <w:top w:val="nil"/>
                 <w:left w:val="nil"/>
@@ -1939,6 +2116,9 @@
                 <w:right w:val="nil"/>
                 <w:between w:val="nil"/>
               </w:pBdr>
+              <w:tabs>
+                <w:tab w:val="right" w:pos="9300"/>
+              </w:tabs>
               <w:spacing w:line="227" w:lineRule="auto"/>
               <w:rPr>
                 <w:rFonts w:ascii="Times New Roman" w:eastAsia="Times New Roman" w:hAnsi="Times New Roman" w:cs="Times New Roman"/>
@@ -1972,7 +2152,7 @@
                     <w:sz w:val="24"/>
                     <w:szCs w:val="24"/>
                   </w:rPr>
-                  <w:t xml:space="preserve">245-540-580</w:t>
+                  <w:t>245-540-580</w:t>
                 </w:r>
               </w:sdtContent>
             </w:sdt>
@@ -2206,7 +2386,7 @@
               <w:sz w:val="24"/>
               <w:szCs w:val="24"/>
             </w:rPr>
-            <w:t xml:space="preserve">Wright, Virna A.</w:t>
+            <w:t>Wright, Virna A.</w:t>
           </w:r>
         </w:sdtContent>
       </w:sdt>
@@ -2251,7 +2431,7 @@
               <w:sz w:val="24"/>
               <w:szCs w:val="24"/>
             </w:rPr>
-            <w:t xml:space="preserve">Argel Chavez, Eva Sandrith</w:t>
+            <w:t>Argel Chavez, Eva Sandrith</w:t>
           </w:r>
         </w:sdtContent>
       </w:sdt>
@@ -2278,7 +2458,7 @@
           <w:szCs w:val="24"/>
           <w:u w:val="single"/>
         </w:rPr>
-        <w:t xml:space="preserve">the Respondent and the undersigned Respondent’s counsel</w:t>
+        <w:t>the Respondent and the undersigned Respondent’s counsel</w:t>
       </w:r>
       <w:r>
         <w:rPr>
@@ -2369,6 +2549,13 @@
           <w:szCs w:val="24"/>
         </w:rPr>
         <w:t xml:space="preserve"> </w:t>
+      </w:r>
+      <w:r>
+        <w:rPr>
+          <w:rFonts w:ascii="Times New Roman" w:eastAsia="Times New Roman" w:hAnsi="Times New Roman" w:cs="Times New Roman"/>
+          <w:sz w:val="24"/>
+          <w:szCs w:val="24"/>
+        </w:rPr>
         <w:tab/>
         <w:t xml:space="preserve">Therefore, Respondent respectfully requests this instant motion be granted and that the judge allows both Respondent and Respondent’s counsel to appear via videoconference (“Webex”) for the purposes of the Respondent’s Individual Hearing.  </w:t>
       </w:r>
@@ -2435,6 +2622,14 @@
           <w:szCs w:val="24"/>
         </w:rPr>
         <w:t>Dated:</w:t>
+      </w:r>
+      <w:r>
+        <w:rPr>
+          <w:rFonts w:ascii="Times New Roman" w:eastAsia="Times New Roman" w:hAnsi="Times New Roman" w:cs="Times New Roman"/>
+          <w:color w:val="000000"/>
+          <w:sz w:val="24"/>
+          <w:szCs w:val="24"/>
+        </w:rPr>
         <w:tab/>
       </w:r>
       <w:r>
@@ -2444,7 +2639,21 @@
           <w:szCs w:val="24"/>
         </w:rPr>
         <w:fldChar w:fldCharType="begin"/>
+      </w:r>
+      <w:r>
+        <w:rPr>
+          <w:rFonts w:ascii="Times New Roman" w:eastAsia="Times New Roman" w:hAnsi="Times New Roman" w:cs="Times New Roman"/>
+          <w:sz w:val="24"/>
+          <w:szCs w:val="24"/>
+        </w:rPr>
         <w:instrText xml:space="preserve"> DATE \@ "MMMM d, yyyy" </w:instrText>
+      </w:r>
+      <w:r>
+        <w:rPr>
+          <w:rFonts w:ascii="Times New Roman" w:eastAsia="Times New Roman" w:hAnsi="Times New Roman" w:cs="Times New Roman"/>
+          <w:sz w:val="24"/>
+          <w:szCs w:val="24"/>
+        </w:rPr>
         <w:fldChar w:fldCharType="separate"/>
       </w:r>
       <w:r>
@@ -2454,7 +2663,7 @@
           <w:sz w:val="24"/>
           <w:szCs w:val="24"/>
         </w:rPr>
-        <w:t>August 5, 2026</w:t>
+        <w:t>August 19, 2026</w:t>
       </w:r>
       <w:r>
         <w:rPr>
@@ -2472,8 +2681,32 @@
           <w:szCs w:val="24"/>
         </w:rPr>
         <w:tab/>
-        <w:tab/>
-        <w:tab/>
+      </w:r>
+      <w:r>
+        <w:rPr>
+          <w:rFonts w:ascii="Times New Roman" w:eastAsia="Times New Roman" w:hAnsi="Times New Roman" w:cs="Times New Roman"/>
+          <w:color w:val="000000"/>
+          <w:sz w:val="24"/>
+          <w:szCs w:val="24"/>
+        </w:rPr>
+        <w:tab/>
+      </w:r>
+      <w:r>
+        <w:rPr>
+          <w:rFonts w:ascii="Times New Roman" w:eastAsia="Times New Roman" w:hAnsi="Times New Roman" w:cs="Times New Roman"/>
+          <w:color w:val="000000"/>
+          <w:sz w:val="24"/>
+          <w:szCs w:val="24"/>
+        </w:rPr>
+        <w:tab/>
+      </w:r>
+      <w:r>
+        <w:rPr>
+          <w:rFonts w:ascii="Times New Roman" w:eastAsia="Times New Roman" w:hAnsi="Times New Roman" w:cs="Times New Roman"/>
+          <w:color w:val="000000"/>
+          <w:sz w:val="24"/>
+          <w:szCs w:val="24"/>
+        </w:rPr>
         <w:tab/>
         <w:t xml:space="preserve">          Respectfully Submitted,</w:t>
       </w:r>
@@ -2577,12 +2810,68 @@
           <w:szCs w:val="24"/>
         </w:rPr>
         <w:tab/>
-        <w:tab/>
-        <w:tab/>
-        <w:tab/>
-        <w:tab/>
-        <w:tab/>
-        <w:tab/>
+      </w:r>
+      <w:r>
+        <w:rPr>
+          <w:rFonts w:ascii="Times New Roman" w:eastAsia="Times New Roman" w:hAnsi="Times New Roman" w:cs="Times New Roman"/>
+          <w:color w:val="000000"/>
+          <w:sz w:val="24"/>
+          <w:szCs w:val="24"/>
+        </w:rPr>
+        <w:tab/>
+      </w:r>
+      <w:r>
+        <w:rPr>
+          <w:rFonts w:ascii="Times New Roman" w:eastAsia="Times New Roman" w:hAnsi="Times New Roman" w:cs="Times New Roman"/>
+          <w:color w:val="000000"/>
+          <w:sz w:val="24"/>
+          <w:szCs w:val="24"/>
+        </w:rPr>
+        <w:tab/>
+      </w:r>
+      <w:r>
+        <w:rPr>
+          <w:rFonts w:ascii="Times New Roman" w:eastAsia="Times New Roman" w:hAnsi="Times New Roman" w:cs="Times New Roman"/>
+          <w:color w:val="000000"/>
+          <w:sz w:val="24"/>
+          <w:szCs w:val="24"/>
+        </w:rPr>
+        <w:tab/>
+      </w:r>
+      <w:r>
+        <w:rPr>
+          <w:rFonts w:ascii="Times New Roman" w:eastAsia="Times New Roman" w:hAnsi="Times New Roman" w:cs="Times New Roman"/>
+          <w:color w:val="000000"/>
+          <w:sz w:val="24"/>
+          <w:szCs w:val="24"/>
+        </w:rPr>
+        <w:tab/>
+      </w:r>
+      <w:r>
+        <w:rPr>
+          <w:rFonts w:ascii="Times New Roman" w:eastAsia="Times New Roman" w:hAnsi="Times New Roman" w:cs="Times New Roman"/>
+          <w:color w:val="000000"/>
+          <w:sz w:val="24"/>
+          <w:szCs w:val="24"/>
+        </w:rPr>
+        <w:tab/>
+      </w:r>
+      <w:r>
+        <w:rPr>
+          <w:rFonts w:ascii="Times New Roman" w:eastAsia="Times New Roman" w:hAnsi="Times New Roman" w:cs="Times New Roman"/>
+          <w:color w:val="000000"/>
+          <w:sz w:val="24"/>
+          <w:szCs w:val="24"/>
+        </w:rPr>
+        <w:tab/>
+      </w:r>
+      <w:r>
+        <w:rPr>
+          <w:rFonts w:ascii="Times New Roman" w:eastAsia="Times New Roman" w:hAnsi="Times New Roman" w:cs="Times New Roman"/>
+          <w:color w:val="000000"/>
+          <w:sz w:val="24"/>
+          <w:szCs w:val="24"/>
+        </w:rPr>
         <w:tab/>
       </w:r>
       <w:sdt>
@@ -2603,7 +2892,7 @@
               <w:sz w:val="24"/>
               <w:szCs w:val="24"/>
             </w:rPr>
-            <w:t xml:space="preserve">____________________________</w:t>
+            <w:t>____________________________</w:t>
           </w:r>
         </w:sdtContent>
       </w:sdt>
@@ -2624,12 +2913,61 @@
           <w:szCs w:val="24"/>
         </w:rPr>
         <w:tab/>
-        <w:tab/>
-        <w:tab/>
-        <w:tab/>
-        <w:tab/>
-        <w:tab/>
-        <w:tab/>
+      </w:r>
+      <w:r>
+        <w:rPr>
+          <w:rFonts w:ascii="Times New Roman" w:eastAsia="Times New Roman" w:hAnsi="Times New Roman" w:cs="Times New Roman"/>
+          <w:sz w:val="24"/>
+          <w:szCs w:val="24"/>
+        </w:rPr>
+        <w:tab/>
+      </w:r>
+      <w:r>
+        <w:rPr>
+          <w:rFonts w:ascii="Times New Roman" w:eastAsia="Times New Roman" w:hAnsi="Times New Roman" w:cs="Times New Roman"/>
+          <w:sz w:val="24"/>
+          <w:szCs w:val="24"/>
+        </w:rPr>
+        <w:tab/>
+      </w:r>
+      <w:r>
+        <w:rPr>
+          <w:rFonts w:ascii="Times New Roman" w:eastAsia="Times New Roman" w:hAnsi="Times New Roman" w:cs="Times New Roman"/>
+          <w:sz w:val="24"/>
+          <w:szCs w:val="24"/>
+        </w:rPr>
+        <w:tab/>
+      </w:r>
+      <w:r>
+        <w:rPr>
+          <w:rFonts w:ascii="Times New Roman" w:eastAsia="Times New Roman" w:hAnsi="Times New Roman" w:cs="Times New Roman"/>
+          <w:sz w:val="24"/>
+          <w:szCs w:val="24"/>
+        </w:rPr>
+        <w:tab/>
+      </w:r>
+      <w:r>
+        <w:rPr>
+          <w:rFonts w:ascii="Times New Roman" w:eastAsia="Times New Roman" w:hAnsi="Times New Roman" w:cs="Times New Roman"/>
+          <w:sz w:val="24"/>
+          <w:szCs w:val="24"/>
+        </w:rPr>
+        <w:tab/>
+      </w:r>
+      <w:r>
+        <w:rPr>
+          <w:rFonts w:ascii="Times New Roman" w:eastAsia="Times New Roman" w:hAnsi="Times New Roman" w:cs="Times New Roman"/>
+          <w:sz w:val="24"/>
+          <w:szCs w:val="24"/>
+        </w:rPr>
+        <w:tab/>
+      </w:r>
+      <w:r>
+        <w:rPr>
+          <w:rFonts w:ascii="Times New Roman" w:eastAsia="Times New Roman" w:hAnsi="Times New Roman" w:cs="Times New Roman"/>
+          <w:sz w:val="24"/>
+          <w:szCs w:val="24"/>
+        </w:rPr>
         <w:tab/>
       </w:r>
       <w:sdt>
@@ -2648,7 +2986,7 @@
               <w:sz w:val="24"/>
               <w:szCs w:val="24"/>
             </w:rPr>
-            <w:t xml:space="preserve">John Negron Esq.</w:t>
+            <w:t>John Negron Esq.</w:t>
           </w:r>
         </w:sdtContent>
       </w:sdt>
@@ -2683,12 +3021,68 @@
           <w:szCs w:val="24"/>
         </w:rPr>
         <w:tab/>
-        <w:tab/>
-        <w:tab/>
-        <w:tab/>
-        <w:tab/>
-        <w:tab/>
-        <w:tab/>
+      </w:r>
+      <w:r>
+        <w:rPr>
+          <w:rFonts w:ascii="Times New Roman" w:eastAsia="Times New Roman" w:hAnsi="Times New Roman" w:cs="Times New Roman"/>
+          <w:color w:val="000000"/>
+          <w:sz w:val="24"/>
+          <w:szCs w:val="24"/>
+        </w:rPr>
+        <w:tab/>
+      </w:r>
+      <w:r>
+        <w:rPr>
+          <w:rFonts w:ascii="Times New Roman" w:eastAsia="Times New Roman" w:hAnsi="Times New Roman" w:cs="Times New Roman"/>
+          <w:color w:val="000000"/>
+          <w:sz w:val="24"/>
+          <w:szCs w:val="24"/>
+        </w:rPr>
+        <w:tab/>
+      </w:r>
+      <w:r>
+        <w:rPr>
+          <w:rFonts w:ascii="Times New Roman" w:eastAsia="Times New Roman" w:hAnsi="Times New Roman" w:cs="Times New Roman"/>
+          <w:color w:val="000000"/>
+          <w:sz w:val="24"/>
+          <w:szCs w:val="24"/>
+        </w:rPr>
+        <w:tab/>
+      </w:r>
+      <w:r>
+        <w:rPr>
+          <w:rFonts w:ascii="Times New Roman" w:eastAsia="Times New Roman" w:hAnsi="Times New Roman" w:cs="Times New Roman"/>
+          <w:color w:val="000000"/>
+          <w:sz w:val="24"/>
+          <w:szCs w:val="24"/>
+        </w:rPr>
+        <w:tab/>
+      </w:r>
+      <w:r>
+        <w:rPr>
+          <w:rFonts w:ascii="Times New Roman" w:eastAsia="Times New Roman" w:hAnsi="Times New Roman" w:cs="Times New Roman"/>
+          <w:color w:val="000000"/>
+          <w:sz w:val="24"/>
+          <w:szCs w:val="24"/>
+        </w:rPr>
+        <w:tab/>
+      </w:r>
+      <w:r>
+        <w:rPr>
+          <w:rFonts w:ascii="Times New Roman" w:eastAsia="Times New Roman" w:hAnsi="Times New Roman" w:cs="Times New Roman"/>
+          <w:color w:val="000000"/>
+          <w:sz w:val="24"/>
+          <w:szCs w:val="24"/>
+        </w:rPr>
+        <w:tab/>
+      </w:r>
+      <w:r>
+        <w:rPr>
+          <w:rFonts w:ascii="Times New Roman" w:eastAsia="Times New Roman" w:hAnsi="Times New Roman" w:cs="Times New Roman"/>
+          <w:color w:val="000000"/>
+          <w:sz w:val="24"/>
+          <w:szCs w:val="24"/>
+        </w:rPr>
         <w:tab/>
         <w:t>Attorney for Respondent,</w:t>
       </w:r>
@@ -2710,10 +3104,45 @@
           <w:szCs w:val="24"/>
         </w:rPr>
         <w:tab/>
-        <w:tab/>
-        <w:tab/>
-        <w:tab/>
-        <w:tab/>
+      </w:r>
+      <w:r>
+        <w:rPr>
+          <w:rFonts w:ascii="Times New Roman" w:eastAsia="Times New Roman" w:hAnsi="Times New Roman" w:cs="Times New Roman"/>
+          <w:sz w:val="24"/>
+          <w:szCs w:val="24"/>
+        </w:rPr>
+        <w:tab/>
+      </w:r>
+      <w:r>
+        <w:rPr>
+          <w:rFonts w:ascii="Times New Roman" w:eastAsia="Times New Roman" w:hAnsi="Times New Roman" w:cs="Times New Roman"/>
+          <w:sz w:val="24"/>
+          <w:szCs w:val="24"/>
+        </w:rPr>
+        <w:tab/>
+      </w:r>
+      <w:r>
+        <w:rPr>
+          <w:rFonts w:ascii="Times New Roman" w:eastAsia="Times New Roman" w:hAnsi="Times New Roman" w:cs="Times New Roman"/>
+          <w:sz w:val="24"/>
+          <w:szCs w:val="24"/>
+        </w:rPr>
+        <w:tab/>
+      </w:r>
+      <w:r>
+        <w:rPr>
+          <w:rFonts w:ascii="Times New Roman" w:eastAsia="Times New Roman" w:hAnsi="Times New Roman" w:cs="Times New Roman"/>
+          <w:sz w:val="24"/>
+          <w:szCs w:val="24"/>
+        </w:rPr>
+        <w:tab/>
+      </w:r>
+      <w:r>
+        <w:rPr>
+          <w:rFonts w:ascii="Times New Roman" w:eastAsia="Times New Roman" w:hAnsi="Times New Roman" w:cs="Times New Roman"/>
+          <w:sz w:val="24"/>
+          <w:szCs w:val="24"/>
+        </w:rPr>
         <w:tab/>
         <w:t xml:space="preserve">                        </w:t>
       </w:r>
@@ -2733,7 +3162,7 @@
               <w:sz w:val="24"/>
               <w:szCs w:val="24"/>
             </w:rPr>
-            <w:t xml:space="preserve">Argel Chavez, Eva Sandrith</w:t>
+            <w:t>Argel Chavez, Eva Sandrith</w:t>
           </w:r>
         </w:sdtContent>
       </w:sdt>
@@ -2862,19 +3291,6 @@
     </w:p>
     <w:p>
       <w:pPr>
-        <w:jc w:val="both"/>
-        <w:rPr>
-          <w:rFonts w:ascii="Times New Roman" w:eastAsia="Times New Roman" w:hAnsi="Times New Roman" w:cs="Times New Roman"/>
-          <w:sz w:val="24"/>
-          <w:szCs w:val="24"/>
-        </w:rPr>
-      </w:pPr>
-    </w:p>
-    <w:p>
-      <w:pPr>
-        <w:tabs>
-          <w:tab w:val="left" w:pos="-720"/>
-        </w:tabs>
         <w:jc w:val="both"/>
         <w:rPr>
           <w:rFonts w:ascii="Times New Roman" w:eastAsia="Times New Roman" w:hAnsi="Times New Roman" w:cs="Times New Roman"/>
@@ -3018,7 +3434,7 @@
               <w:sz w:val="24"/>
               <w:szCs w:val="24"/>
             </w:rPr>
-            <w:t xml:space="preserve">Argel Chavez, Eva Sandrith</w:t>
+            <w:t>Argel Chavez, Eva Sandrith</w:t>
           </w:r>
         </w:sdtContent>
       </w:sdt>
@@ -3074,7 +3490,7 @@
               <w:sz w:val="24"/>
               <w:szCs w:val="24"/>
             </w:rPr>
-            <w:t xml:space="preserve">245-540-580</w:t>
+            <w:t>245-540-580</w:t>
           </w:r>
         </w:sdtContent>
       </w:sdt>
@@ -3532,8 +3948,29 @@
           <w:szCs w:val="24"/>
         </w:rPr>
         <w:t>_________________________________________</w:t>
-        <w:tab/>
-        <w:tab/>
+      </w:r>
+      <w:r>
+        <w:rPr>
+          <w:rFonts w:ascii="Times New Roman" w:hAnsi="Times New Roman" w:cs="Times New Roman"/>
+          <w:sz w:val="24"/>
+          <w:szCs w:val="24"/>
+        </w:rPr>
+        <w:tab/>
+      </w:r>
+      <w:r>
+        <w:rPr>
+          <w:rFonts w:ascii="Times New Roman" w:hAnsi="Times New Roman" w:cs="Times New Roman"/>
+          <w:sz w:val="24"/>
+          <w:szCs w:val="24"/>
+        </w:rPr>
+        <w:tab/>
+      </w:r>
+      <w:r>
+        <w:rPr>
+          <w:rFonts w:ascii="Times New Roman" w:hAnsi="Times New Roman" w:cs="Times New Roman"/>
+          <w:sz w:val="24"/>
+          <w:szCs w:val="24"/>
+        </w:rPr>
         <w:tab/>
         <w:t>_______________________</w:t>
       </w:r>
@@ -3571,7 +4008,7 @@
               <w:sz w:val="24"/>
               <w:szCs w:val="24"/>
             </w:rPr>
-            <w:t xml:space="preserve">Wright, Virna A.</w:t>
+            <w:t>Wright, Virna A.</w:t>
           </w:r>
         </w:sdtContent>
       </w:sdt>
@@ -3582,6 +4019,13 @@
           <w:szCs w:val="24"/>
         </w:rPr>
         <w:tab/>
+      </w:r>
+      <w:r>
+        <w:rPr>
+          <w:rFonts w:ascii="Times New Roman" w:eastAsia="Times New Roman" w:hAnsi="Times New Roman" w:cs="Times New Roman"/>
+          <w:sz w:val="24"/>
+          <w:szCs w:val="24"/>
+        </w:rPr>
         <w:tab/>
         <w:t xml:space="preserve">Date </w:t>
       </w:r>
@@ -3704,7 +4148,7 @@
           <w:szCs w:val="24"/>
         </w:rPr>
         <w:sectPr>
-          <w:footerReference w:type="default" r:id="rId10"/>
+          <w:footerReference w:type="default" r:id="rId9"/>
           <w:pgSz w:w="12240" w:h="15840"/>
           <w:pgMar w:top="1440" w:right="1440" w:bottom="1440" w:left="1440" w:header="720" w:footer="432" w:gutter="0"/>
           <w:pgNumType w:start="1"/>
@@ -3777,7 +4221,7 @@
               <w:sz w:val="24"/>
               <w:szCs w:val="24"/>
             </w:rPr>
-            <w:t xml:space="preserve">245-540-580</w:t>
+            <w:t>245-540-580</w:t>
           </w:r>
         </w:sdtContent>
       </w:sdt>
@@ -3884,7 +4328,7 @@
               <w:szCs w:val="24"/>
               <w:u w:val="single"/>
             </w:rPr>
-            <w:t xml:space="preserve">Lorenzo Bracamontes</w:t>
+            <w:t>Lorenzo Bracamontes</w:t>
           </w:r>
         </w:sdtContent>
       </w:sdt>
@@ -3963,8 +4407,32 @@
           <w:szCs w:val="24"/>
         </w:rPr>
         <w:t xml:space="preserve">Executed on </w:t>
+      </w:r>
+      <w:r>
+        <w:rPr>
+          <w:rFonts w:ascii="Times New Roman" w:hAnsi="Times New Roman" w:cs="Times New Roman"/>
+          <w:spacing w:val="-3"/>
+          <w:sz w:val="24"/>
+          <w:szCs w:val="24"/>
+        </w:rPr>
         <w:fldChar w:fldCharType="begin"/>
+      </w:r>
+      <w:r>
+        <w:rPr>
+          <w:rFonts w:ascii="Times New Roman" w:hAnsi="Times New Roman" w:cs="Times New Roman"/>
+          <w:spacing w:val="-3"/>
+          <w:sz w:val="24"/>
+          <w:szCs w:val="24"/>
+        </w:rPr>
         <w:instrText xml:space="preserve"> DATE \@ "MMMM d, yyyy" </w:instrText>
+      </w:r>
+      <w:r>
+        <w:rPr>
+          <w:rFonts w:ascii="Times New Roman" w:hAnsi="Times New Roman" w:cs="Times New Roman"/>
+          <w:spacing w:val="-3"/>
+          <w:sz w:val="24"/>
+          <w:szCs w:val="24"/>
+        </w:rPr>
         <w:fldChar w:fldCharType="separate"/>
       </w:r>
       <w:r>
@@ -3975,7 +4443,7 @@
           <w:sz w:val="24"/>
           <w:szCs w:val="24"/>
         </w:rPr>
-        <w:t>August 5, 2026</w:t>
+        <w:t>August 19, 2026</w:t>
       </w:r>
       <w:r>
         <w:rPr>
@@ -4034,7 +4502,7 @@
               <w:sz w:val="24"/>
               <w:szCs w:val="24"/>
             </w:rPr>
-            <w:t xml:space="preserve">___________________</w:t>
+            <w:t>___________________</w:t>
           </w:r>
         </w:sdtContent>
       </w:sdt>
@@ -4103,8 +4571,32 @@
           <w:szCs w:val="24"/>
         </w:rPr>
         <w:t xml:space="preserve">Date: </w:t>
+      </w:r>
+      <w:r>
+        <w:rPr>
+          <w:rFonts w:ascii="Times New Roman" w:hAnsi="Times New Roman" w:cs="Times New Roman"/>
+          <w:spacing w:val="-3"/>
+          <w:sz w:val="24"/>
+          <w:szCs w:val="24"/>
+        </w:rPr>
         <w:fldChar w:fldCharType="begin"/>
+      </w:r>
+      <w:r>
+        <w:rPr>
+          <w:rFonts w:ascii="Times New Roman" w:hAnsi="Times New Roman" w:cs="Times New Roman"/>
+          <w:spacing w:val="-3"/>
+          <w:sz w:val="24"/>
+          <w:szCs w:val="24"/>
+        </w:rPr>
         <w:instrText xml:space="preserve"> DATE \@ "M/d/yyyy" </w:instrText>
+      </w:r>
+      <w:r>
+        <w:rPr>
+          <w:rFonts w:ascii="Times New Roman" w:hAnsi="Times New Roman" w:cs="Times New Roman"/>
+          <w:spacing w:val="-3"/>
+          <w:sz w:val="24"/>
+          <w:szCs w:val="24"/>
+        </w:rPr>
         <w:fldChar w:fldCharType="separate"/>
       </w:r>
       <w:r>
@@ -4115,7 +4607,7 @@
           <w:sz w:val="24"/>
           <w:szCs w:val="24"/>
         </w:rPr>
-        <w:t>8/5/2026</w:t>
+        <w:t>8/19/2026</w:t>
       </w:r>
       <w:r>
         <w:rPr>
@@ -4151,7 +4643,7 @@
           <w:sz w:val="24"/>
           <w:szCs w:val="24"/>
         </w:rPr>
-        <w:t xml:space="preserve">Kostiv CARDINAL INTERNATIONAL LAW GROUP CORP.</w:t>
+        <w:t>Kostiv CARDINAL INTERNATIONAL LAW GROUP CORP.</w:t>
       </w:r>
     </w:p>
     <w:p>
@@ -4257,7 +4749,7 @@
       </w:pPr>
     </w:p>
     <w:sectPr>
-      <w:footerReference w:type="default" r:id="rId12"/>
+      <w:footerReference w:type="default" r:id="rId10"/>
       <w:pgSz w:w="12240" w:h="15840"/>
       <w:pgMar w:top="1440" w:right="1440" w:bottom="1440" w:left="1440" w:header="720" w:footer="432" w:gutter="0"/>
       <w:pgNumType w:start="1"/>

</xml_diff>